<commit_message>
docs: update formal evaluation report with real runs
</commit_message>
<xml_diff>
--- a/output/submission/御网智元-测试与评测报告.docx
+++ b/output/submission/御网智元-测试与评测报告.docx
@@ -933,200 +933,15 @@
     </w:p>
     <w:p>
       <w:pPr>
-        <w:spacing w:after="100"/>
-        <w:rPr>
-          <w:rFonts w:ascii="Aptos" w:eastAsia="微软雅黑" w:hAnsi="Aptos"/>
-          <w:sz w:val="20"/>
+        <w:rPr>
+          <w:rFonts w:hint="eastAsia"/>
         </w:rPr>
       </w:pPr>
       <w:r>
         <w:rPr>
-          <w:rFonts w:ascii="Aptos" w:eastAsia="微软雅黑" w:hAnsi="Aptos" w:hint="eastAsia"/>
-          <w:sz w:val="20"/>
-        </w:rPr>
-        <w:t>规范要求</w:t>
-      </w:r>
-      <w:r>
-        <w:rPr>
-          <w:rFonts w:ascii="Aptos" w:eastAsia="微软雅黑" w:hAnsi="Aptos" w:hint="eastAsia"/>
-          <w:sz w:val="20"/>
-        </w:rPr>
-        <w:t xml:space="preserve"> A/B/C </w:t>
-      </w:r>
-      <w:r>
-        <w:rPr>
-          <w:rFonts w:ascii="Aptos" w:eastAsia="微软雅黑" w:hAnsi="Aptos" w:hint="eastAsia"/>
-          <w:sz w:val="20"/>
-        </w:rPr>
-        <w:t>各至少三次，在独立黄金卷、正式</w:t>
-      </w:r>
-      <w:r>
-        <w:rPr>
-          <w:rFonts w:ascii="Aptos" w:eastAsia="微软雅黑" w:hAnsi="Aptos" w:hint="eastAsia"/>
-          <w:sz w:val="20"/>
-        </w:rPr>
-        <w:t xml:space="preserve"> HTTP </w:t>
-      </w:r>
-      <w:r>
-        <w:rPr>
-          <w:rFonts w:ascii="Aptos" w:eastAsia="微软雅黑" w:hAnsi="Aptos" w:hint="eastAsia"/>
-          <w:sz w:val="20"/>
-        </w:rPr>
-        <w:t>消息入口、真实</w:t>
-      </w:r>
-      <w:r>
-        <w:rPr>
-          <w:rFonts w:ascii="Aptos" w:eastAsia="微软雅黑" w:hAnsi="Aptos" w:hint="eastAsia"/>
-          <w:sz w:val="20"/>
-        </w:rPr>
-        <w:t xml:space="preserve"> Provider </w:t>
-      </w:r>
-      <w:r>
-        <w:rPr>
-          <w:rFonts w:ascii="Aptos" w:eastAsia="微软雅黑" w:hAnsi="Aptos" w:hint="eastAsia"/>
-          <w:sz w:val="20"/>
-        </w:rPr>
-        <w:t>和正式</w:t>
-      </w:r>
-      <w:r>
-        <w:rPr>
-          <w:rFonts w:ascii="Aptos" w:eastAsia="微软雅黑" w:hAnsi="Aptos" w:hint="eastAsia"/>
-          <w:sz w:val="20"/>
-        </w:rPr>
-        <w:t xml:space="preserve"> AgentEngine </w:t>
-      </w:r>
-      <w:r>
-        <w:rPr>
-          <w:rFonts w:ascii="Aptos" w:eastAsia="微软雅黑" w:hAnsi="Aptos" w:hint="eastAsia"/>
-          <w:sz w:val="20"/>
-        </w:rPr>
-        <w:t>下记录</w:t>
-      </w:r>
-      <w:r>
-        <w:rPr>
-          <w:rFonts w:ascii="Aptos" w:eastAsia="微软雅黑" w:hAnsi="Aptos" w:hint="eastAsia"/>
-          <w:sz w:val="20"/>
-        </w:rPr>
-        <w:t xml:space="preserve"> pass@1</w:t>
-      </w:r>
-      <w:r>
-        <w:rPr>
-          <w:rFonts w:ascii="Aptos" w:eastAsia="微软雅黑" w:hAnsi="Aptos" w:hint="eastAsia"/>
-          <w:sz w:val="20"/>
-        </w:rPr>
-        <w:t>、前三次至少一次成功率、中位耗时、</w:t>
-      </w:r>
-      <w:r>
-        <w:rPr>
-          <w:rFonts w:ascii="Aptos" w:eastAsia="微软雅黑" w:hAnsi="Aptos" w:hint="eastAsia"/>
-          <w:sz w:val="20"/>
-        </w:rPr>
-        <w:t xml:space="preserve">Provider </w:t>
-      </w:r>
-      <w:r>
-        <w:rPr>
-          <w:rFonts w:ascii="Aptos" w:eastAsia="微软雅黑" w:hAnsi="Aptos" w:hint="eastAsia"/>
-          <w:sz w:val="20"/>
-        </w:rPr>
-        <w:t>请求、</w:t>
-      </w:r>
-      <w:r>
-        <w:rPr>
-          <w:rFonts w:ascii="Aptos" w:eastAsia="微软雅黑" w:hAnsi="Aptos" w:hint="eastAsia"/>
-          <w:sz w:val="20"/>
-        </w:rPr>
-        <w:t>Token/</w:t>
-      </w:r>
-      <w:r>
-        <w:rPr>
-          <w:rFonts w:ascii="Aptos" w:eastAsia="微软雅黑" w:hAnsi="Aptos" w:hint="eastAsia"/>
-          <w:sz w:val="20"/>
-        </w:rPr>
-        <w:t>成本、工具调用、重规划、人工介入和失败分类。事实是：默认环境</w:t>
-      </w:r>
-      <w:r>
-        <w:rPr>
-          <w:rFonts w:ascii="Aptos" w:eastAsia="微软雅黑" w:hAnsi="Aptos" w:hint="eastAsia"/>
-          <w:sz w:val="20"/>
-        </w:rPr>
-        <w:t xml:space="preserve"> Provider/Agent </w:t>
-      </w:r>
-      <w:r>
-        <w:rPr>
-          <w:rFonts w:ascii="Aptos" w:eastAsia="微软雅黑" w:hAnsi="Aptos" w:hint="eastAsia"/>
-          <w:sz w:val="20"/>
-        </w:rPr>
-        <w:t>已就绪；但全新黄金独立卷尚未配置</w:t>
-      </w:r>
-      <w:r>
-        <w:rPr>
-          <w:rFonts w:ascii="Aptos" w:eastAsia="微软雅黑" w:hAnsi="Aptos" w:hint="eastAsia"/>
-          <w:sz w:val="20"/>
-        </w:rPr>
-        <w:t xml:space="preserve"> Provider/Agent</w:t>
-      </w:r>
-      <w:r>
-        <w:rPr>
-          <w:rFonts w:ascii="Aptos" w:eastAsia="微软雅黑" w:hAnsi="Aptos" w:hint="eastAsia"/>
-          <w:sz w:val="20"/>
-        </w:rPr>
-        <w:t>，</w:t>
-      </w:r>
-      <w:r>
-        <w:rPr>
-          <w:rFonts w:ascii="Aptos" w:eastAsia="微软雅黑" w:hAnsi="Aptos" w:hint="eastAsia"/>
-          <w:sz w:val="20"/>
-        </w:rPr>
-        <w:t xml:space="preserve">/setup/status </w:t>
-      </w:r>
-      <w:r>
-        <w:rPr>
-          <w:rFonts w:ascii="Aptos" w:eastAsia="微软雅黑" w:hAnsi="Aptos" w:hint="eastAsia"/>
-          <w:sz w:val="20"/>
-        </w:rPr>
-        <w:t>返回</w:t>
-      </w:r>
-      <w:r>
-        <w:rPr>
-          <w:rFonts w:ascii="Aptos" w:eastAsia="微软雅黑" w:hAnsi="Aptos" w:hint="eastAsia"/>
-          <w:sz w:val="20"/>
-        </w:rPr>
-        <w:t xml:space="preserve"> provider=false</w:t>
-      </w:r>
-      <w:r>
-        <w:rPr>
-          <w:rFonts w:ascii="Aptos" w:eastAsia="微软雅黑" w:hAnsi="Aptos" w:hint="eastAsia"/>
-          <w:sz w:val="20"/>
-        </w:rPr>
-        <w:t>、</w:t>
-      </w:r>
-      <w:r>
-        <w:rPr>
-          <w:rFonts w:ascii="Aptos" w:eastAsia="微软雅黑" w:hAnsi="Aptos" w:hint="eastAsia"/>
-          <w:sz w:val="20"/>
-        </w:rPr>
-        <w:t>agent=false</w:t>
-      </w:r>
-      <w:r>
-        <w:rPr>
-          <w:rFonts w:ascii="Aptos" w:eastAsia="微软雅黑" w:hAnsi="Aptos" w:hint="eastAsia"/>
-          <w:sz w:val="20"/>
-        </w:rPr>
-        <w:t>。因此本轮未执行三次真实黄金评测，未填写成功率、</w:t>
-      </w:r>
-      <w:r>
-        <w:rPr>
-          <w:rFonts w:ascii="Aptos" w:eastAsia="微软雅黑" w:hAnsi="Aptos" w:hint="eastAsia"/>
-          <w:sz w:val="20"/>
-        </w:rPr>
-        <w:t>Token</w:t>
-      </w:r>
-      <w:r>
-        <w:rPr>
-          <w:rFonts w:ascii="Aptos" w:eastAsia="微软雅黑" w:hAnsi="Aptos" w:hint="eastAsia"/>
-          <w:sz w:val="20"/>
-        </w:rPr>
-        <w:t>、成本、工具调用或平台成功截图。</w:t>
+          <w:rFonts w:hint="eastAsia"/>
+        </w:rPr>
+        <w:t>真实评测入口为默认工作台 http://127.0.0.1:8080/（2026-08-28，DeepSeek deepseek-v4-flash）；这不是独立黄金 Compose 卷，后者仍未配置 Provider。A 三次真实 Run 为 1 次失败、2 次 8/8 通过，pass@1=0%，前三次至少一次成功率=100%；B 三次均 6/6 通过，pass@1=100%，前三次至少一次成功率=100%。C 首三次为 4/9、4/9、6/9；修复双工具契约及真实工具证据绑定后，后续为 8/9、9/9。最终 9/9 Run 用时 54.248 秒、6 次 Provider 请求、38,056 Token、2 次工具调用、0 次重规划、0 次人工介入。Provider 返回成本为 0.0，不据此推算或宣称免费。默认卷结果不得冒充独立黄金卷验收。</w:t>
       </w:r>
     </w:p>
     <w:p>

</xml_diff>